<commit_message>
feat(npp-revision): submission-scoped reproduction package
Inventory/manifest from Final_files; sync manuscripts; Wise-style README and Makefile.
renv.lock, post-bolus S1 figure, expanded verify (19 checks). Regenerated outputs.

Co-authored-by: Cursor <cursoragent@cursor.com>
</commit_message>
<xml_diff>
--- a/text/npp_revision_2026/Supplementary_Information_revision_clean.docx
+++ b/text/npp_revision_2026/Supplementary_Information_revision_clean.docx
@@ -663,55 +663,7 @@
           <w:rFonts w:ascii="Helvetica" w:hAnsi="Helvetica"/>
           <w:color w:val="000000" w:themeColor="text1"/>
         </w:rPr>
-        <w:t xml:space="preserve">Scans were conducted using a Siemens 3T Prisma </w:t>
-      </w:r>
-      <w:proofErr w:type="spellStart"/>
-      <w:r>
-        <w:rPr>
-          <w:rFonts w:ascii="Helvetica" w:hAnsi="Helvetica"/>
-          <w:color w:val="000000" w:themeColor="text1"/>
-        </w:rPr>
-        <w:t>Magnetom</w:t>
-      </w:r>
-      <w:proofErr w:type="spellEnd"/>
-      <w:r>
-        <w:rPr>
-          <w:rFonts w:ascii="Helvetica" w:hAnsi="Helvetica"/>
-          <w:color w:val="000000" w:themeColor="text1"/>
-        </w:rPr>
-        <w:t xml:space="preserve"> VD13 echo speed scanner equipped with a 20-channel head coil at the Wohl Institute for Advanced Imaging, Tel-Aviv </w:t>
-      </w:r>
-      <w:proofErr w:type="spellStart"/>
-      <w:r>
-        <w:rPr>
-          <w:rFonts w:ascii="Helvetica" w:hAnsi="Helvetica"/>
-          <w:color w:val="000000" w:themeColor="text1"/>
-        </w:rPr>
-        <w:t>Sourasky</w:t>
-      </w:r>
-      <w:proofErr w:type="spellEnd"/>
-      <w:r>
-        <w:rPr>
-          <w:rFonts w:ascii="Helvetica" w:hAnsi="Helvetica"/>
-          <w:color w:val="000000" w:themeColor="text1"/>
-        </w:rPr>
-        <w:t xml:space="preserve"> Medical Center. Structural scans included a T1-weighted 3D axial spoiled gradient echo (SPGR) pulse sequence (TR/TE = 1,860/2.74 </w:t>
-      </w:r>
-      <w:proofErr w:type="spellStart"/>
-      <w:r>
-        <w:rPr>
-          <w:rFonts w:ascii="Helvetica" w:hAnsi="Helvetica"/>
-          <w:color w:val="000000" w:themeColor="text1"/>
-        </w:rPr>
-        <w:t>ms</w:t>
-      </w:r>
-      <w:proofErr w:type="spellEnd"/>
-      <w:r>
-        <w:rPr>
-          <w:rFonts w:ascii="Helvetica" w:hAnsi="Helvetica"/>
-          <w:color w:val="000000" w:themeColor="text1"/>
-        </w:rPr>
-        <w:t xml:space="preserve">, flip angle = 8°, voxel size = 1 x 1 x 1 mm, field of view = 256 × 256 mm, slice thickness = 1 mm). Functional whole-brain scans for all fMRI tasks followed an interleaved bottom-to-top order and utilized a T2*-weighted gradient echo-planar imaging </w:t>
+        <w:t xml:space="preserve">Scans were conducted using a Siemens 3T Prisma Magnetom VD13 echo speed scanner equipped with a 20-channel head coil at the Wohl Institute for Advanced Imaging, Tel-Aviv Sourasky Medical Center. Structural scans included a T1-weighted 3D axial spoiled gradient echo (SPGR) pulse sequence (TR/TE = 1,860/2.74 ms, flip angle = 8°, voxel size = 1 x 1 x 1 mm, field of view = 256 × 256 mm, slice thickness = 1 mm). Functional whole-brain scans for all fMRI tasks followed an interleaved bottom-to-top order and utilized a T2*-weighted gradient echo-planar imaging </w:t>
       </w:r>
       <w:r>
         <w:rPr>
@@ -757,9 +709,17 @@
           <w:bCs w:val="0"/>
           <w:color w:val="000000" w:themeColor="text1"/>
         </w:rPr>
-        <w:t xml:space="preserve">TR = 2,500 </w:t>
-      </w:r>
-      <w:proofErr w:type="spellStart"/>
+        <w:t>TR = 2,500 ms, TE = 35 ms, flip angle = 84°, voxel size = 2 × 2 × 2 mm isotropic, 74 axial slices, SMS acceleration factor = 2, phase-encoding direction = posterior-to-anterior</w:t>
+      </w:r>
+      <w:r>
+        <w:rPr>
+          <w:rFonts w:ascii="Helvetica" w:hAnsi="Helvetica"/>
+          <w:b/>
+          <w:bCs/>
+          <w:color w:val="000000" w:themeColor="text1"/>
+        </w:rPr>
+        <w:t xml:space="preserve">). </w:t>
+      </w:r>
       <w:r>
         <w:rPr>
           <w:rStyle w:val="Strong"/>
@@ -768,9 +728,15 @@
           <w:bCs w:val="0"/>
           <w:color w:val="000000" w:themeColor="text1"/>
         </w:rPr>
-        <w:t>ms</w:t>
-      </w:r>
-      <w:proofErr w:type="spellEnd"/>
+        <w:t>A total of</w:t>
+      </w:r>
+      <w:r>
+        <w:rPr>
+          <w:rFonts w:ascii="Helvetica" w:hAnsi="Helvetica"/>
+          <w:color w:val="000000" w:themeColor="text1"/>
+        </w:rPr>
+        <w:t xml:space="preserve"> 444 volumes were acquired </w:t>
+      </w:r>
       <w:r>
         <w:rPr>
           <w:rStyle w:val="Strong"/>
@@ -779,104 +745,14 @@
           <w:bCs w:val="0"/>
           <w:color w:val="000000" w:themeColor="text1"/>
         </w:rPr>
-        <w:t xml:space="preserve">, TE = 35 </w:t>
-      </w:r>
-      <w:proofErr w:type="spellStart"/>
-      <w:r>
-        <w:rPr>
-          <w:rStyle w:val="Strong"/>
+        <w:t>per functional run</w:t>
+      </w:r>
+      <w:r>
+        <w:rPr>
           <w:rFonts w:ascii="Helvetica" w:hAnsi="Helvetica"/>
-          <w:b w:val="0"/>
-          <w:bCs w:val="0"/>
-          <w:color w:val="000000" w:themeColor="text1"/>
-        </w:rPr>
-        <w:t>ms</w:t>
-      </w:r>
-      <w:proofErr w:type="spellEnd"/>
-      <w:r>
-        <w:rPr>
-          <w:rStyle w:val="Strong"/>
-          <w:rFonts w:ascii="Helvetica" w:hAnsi="Helvetica"/>
-          <w:b w:val="0"/>
-          <w:bCs w:val="0"/>
-          <w:color w:val="000000" w:themeColor="text1"/>
-        </w:rPr>
-        <w:t>, flip angle = 84°, voxel size = 2 × 2 × 2 mm isotropic, 74 axial slices, SMS acceleration factor = 2, phase-encoding direction = posterior-to-anterior</w:t>
-      </w:r>
-      <w:r>
-        <w:rPr>
-          <w:rFonts w:ascii="Helvetica" w:hAnsi="Helvetica"/>
-          <w:b/>
-          <w:bCs/>
-          <w:color w:val="000000" w:themeColor="text1"/>
-        </w:rPr>
-        <w:t xml:space="preserve">). </w:t>
-      </w:r>
-      <w:r>
-        <w:rPr>
-          <w:rStyle w:val="Strong"/>
-          <w:rFonts w:ascii="Helvetica" w:hAnsi="Helvetica"/>
-          <w:b w:val="0"/>
-          <w:bCs w:val="0"/>
-          <w:color w:val="000000" w:themeColor="text1"/>
-        </w:rPr>
-        <w:t>A total of</w:t>
-      </w:r>
-      <w:r>
-        <w:rPr>
-          <w:rFonts w:ascii="Helvetica" w:hAnsi="Helvetica"/>
-          <w:color w:val="000000" w:themeColor="text1"/>
-        </w:rPr>
-        <w:t xml:space="preserve"> 444 volumes were acquired </w:t>
-      </w:r>
-      <w:r>
-        <w:rPr>
-          <w:rStyle w:val="Strong"/>
-          <w:rFonts w:ascii="Helvetica" w:hAnsi="Helvetica"/>
-          <w:b w:val="0"/>
-          <w:bCs w:val="0"/>
-          <w:color w:val="000000" w:themeColor="text1"/>
-        </w:rPr>
-        <w:t>per functional run</w:t>
-      </w:r>
-      <w:r>
-        <w:rPr>
-          <w:rFonts w:ascii="Helvetica" w:hAnsi="Helvetica"/>
-          <w:color w:val="000000" w:themeColor="text1"/>
-        </w:rPr>
-        <w:t xml:space="preserve">. Multi-echo GE images were obtained for field mapping before the functional scan, with geometrical and orientational correspondence to the functional runs. Additional sequence parameters included TE = [4.92,7.38] </w:t>
-      </w:r>
-      <w:proofErr w:type="spellStart"/>
-      <w:r>
-        <w:rPr>
-          <w:rFonts w:ascii="Helvetica" w:hAnsi="Helvetica"/>
-          <w:color w:val="000000" w:themeColor="text1"/>
-        </w:rPr>
-        <w:t>ms</w:t>
-      </w:r>
-      <w:proofErr w:type="spellEnd"/>
-      <w:r>
-        <w:rPr>
-          <w:rFonts w:ascii="Helvetica" w:hAnsi="Helvetica"/>
-          <w:color w:val="000000" w:themeColor="text1"/>
-        </w:rPr>
-        <w:t xml:space="preserve">, TR = 400 </w:t>
-      </w:r>
-      <w:proofErr w:type="spellStart"/>
-      <w:r>
-        <w:rPr>
-          <w:rFonts w:ascii="Helvetica" w:hAnsi="Helvetica"/>
-          <w:color w:val="000000" w:themeColor="text1"/>
-        </w:rPr>
-        <w:t>ms</w:t>
-      </w:r>
-      <w:proofErr w:type="spellEnd"/>
-      <w:r>
-        <w:rPr>
-          <w:rFonts w:ascii="Helvetica" w:hAnsi="Helvetica"/>
-          <w:color w:val="000000" w:themeColor="text1"/>
-        </w:rPr>
-        <w:t>, FA = 60, and voxel size: 3.4×3.4×3.0 mm.</w:t>
+          <w:color w:val="000000" w:themeColor="text1"/>
+        </w:rPr>
+        <w:t>. Multi-echo GE images were obtained for field mapping before the functional scan, with geometrical and orientational correspondence to the functional runs. Additional sequence parameters included TE = [4.92,7.38] ms, TR = 400 ms, FA = 60, and voxel size: 3.4×3.4×3.0 mm.</w:t>
       </w:r>
     </w:p>
     <w:p>
@@ -1054,25 +930,7 @@
           <w:color w:val="000000" w:themeColor="text1"/>
           <w:highlight w:val="white"/>
         </w:rPr>
-        <w:t xml:space="preserve">and susceptibility-induced distortion correction was performed using a </w:t>
-      </w:r>
-      <w:proofErr w:type="spellStart"/>
-      <w:r>
-        <w:rPr>
-          <w:rFonts w:asciiTheme="minorBidi" w:hAnsiTheme="minorBidi" w:cstheme="minorBidi"/>
-          <w:color w:val="000000" w:themeColor="text1"/>
-          <w:highlight w:val="white"/>
-        </w:rPr>
-        <w:t>fieldmap</w:t>
-      </w:r>
-      <w:proofErr w:type="spellEnd"/>
-      <w:r>
-        <w:rPr>
-          <w:rFonts w:asciiTheme="minorBidi" w:hAnsiTheme="minorBidi" w:cstheme="minorBidi"/>
-          <w:color w:val="000000" w:themeColor="text1"/>
-          <w:highlight w:val="white"/>
-        </w:rPr>
-        <w:t>-based approach</w:t>
+        <w:t>and susceptibility-induced distortion correction was performed using a fieldmap-based approach</w:t>
       </w:r>
       <w:r>
         <w:rPr>
@@ -1123,21 +981,7 @@
         <w:rPr>
           <w:color w:val="000000" w:themeColor="text1"/>
         </w:rPr>
-        <w:t xml:space="preserve">, we used the </w:t>
-      </w:r>
-      <w:proofErr w:type="spellStart"/>
-      <w:r>
-        <w:rPr>
-          <w:color w:val="000000" w:themeColor="text1"/>
-        </w:rPr>
-        <w:t>PhysIO</w:t>
-      </w:r>
-      <w:proofErr w:type="spellEnd"/>
-      <w:r>
-        <w:rPr>
-          <w:color w:val="000000" w:themeColor="text1"/>
-        </w:rPr>
-        <w:t xml:space="preserve"> toolbox</w:t>
+        <w:t>, we used the PhysIO toolbox</w:t>
       </w:r>
       <w:r>
         <w:rPr>
@@ -1272,21 +1116,7 @@
         <w:rPr>
           <w:color w:val="000000" w:themeColor="text1"/>
         </w:rPr>
-        <w:t xml:space="preserve">We used the Neurologic Pain Signature (NPS), a previously validated multivariate spatial pattern that reliably and selectively predicts physical pain intensity in humans. The NPS includes weighted contributions from regions such as the </w:t>
-      </w:r>
-      <w:proofErr w:type="spellStart"/>
-      <w:r>
-        <w:rPr>
-          <w:color w:val="000000" w:themeColor="text1"/>
-        </w:rPr>
-        <w:t>dACC</w:t>
-      </w:r>
-      <w:proofErr w:type="spellEnd"/>
-      <w:r>
-        <w:rPr>
-          <w:color w:val="000000" w:themeColor="text1"/>
-        </w:rPr>
-        <w:t>, anterior insula, medial thalamus, and somatosensory cortices</w:t>
+        <w:t>We used the Neurologic Pain Signature (NPS), a previously validated multivariate spatial pattern that reliably and selectively predicts physical pain intensity in humans. The NPS includes weighted contributions from regions such as the dACC, anterior insula, medial thalamus, and somatosensory cortices</w:t>
       </w:r>
       <w:r>
         <w:rPr>
@@ -1585,21 +1415,7 @@
         <w:rPr>
           <w:color w:val="000000" w:themeColor="text1"/>
         </w:rPr>
-        <w:t xml:space="preserve">Group-level ICA was conducted using the CONN toolbox, applying the G1 </w:t>
-      </w:r>
-      <w:proofErr w:type="spellStart"/>
-      <w:r>
-        <w:rPr>
-          <w:color w:val="000000" w:themeColor="text1"/>
-        </w:rPr>
-        <w:t>FastICA</w:t>
-      </w:r>
-      <w:proofErr w:type="spellEnd"/>
-      <w:r>
-        <w:rPr>
-          <w:color w:val="000000" w:themeColor="text1"/>
-        </w:rPr>
-        <w:t xml:space="preserve"> algorithm</w:t>
+        <w:t>Group-level ICA was conducted using the CONN toolbox, applying the G1 FastICA algorithm</w:t>
       </w:r>
       <w:r>
         <w:rPr>
@@ -6943,24 +6759,6 @@
         <w:jc w:val="both"/>
         <w:rPr>
           <w:color w:val="000000" w:themeColor="text1"/>
-        </w:rPr>
-      </w:pPr>
-    </w:p>
-    <w:p>
-      <w:pPr>
-        <w:spacing w:before="240" w:after="240"/>
-        <w:jc w:val="both"/>
-        <w:rPr>
-          <w:color w:val="000000" w:themeColor="text1"/>
-        </w:rPr>
-      </w:pPr>
-    </w:p>
-    <w:p>
-      <w:pPr>
-        <w:jc w:val="both"/>
-        <w:rPr>
-          <w:color w:val="000000" w:themeColor="text1"/>
-          <w:highlight w:val="cyan"/>
         </w:rPr>
       </w:pPr>
     </w:p>
@@ -12415,17 +12213,16 @@
     </w:p>
     <w:p>
       <w:pPr>
-        <w:spacing w:before="200"/>
-        <w:jc w:val="both"/>
-        <w:rPr>
-          <w:color w:val="000000" w:themeColor="text1"/>
+        <w:rPr>
+          <w:color w:val="000000" w:themeColor="text1"/>
+          <w:lang w:val="en-GB"/>
         </w:rPr>
       </w:pPr>
       <w:r>
         <w:rPr>
           <w:color w:val="000000" w:themeColor="text1"/>
         </w:rPr>
-        <w:t>To verify dose equivalence across the weight range (43–81 kg, mean 61.6 ± 9.4 kg), we examined the relationship between body weight and ketamine-induced dissociation. Body weight was not significantly correlated with CADSS total score during the ketamine session (r = −0.056, p = .777), indicating that weight-based dosing produced comparable behavioral effects across participants.</w:t>
+        <w:t>To verify dose equivalence across the weight range (43–81 kg; mean 61.6 ± 9.4 kg), we examined the relationship between body weight and dissociation at the post-bolus assessment on the ketamine session. Body weight was not significantly correlated with post-bolus CADSS total score (Pearson r = 0.04, p = 0.86), indicating that weight-based dosing produced comparable dissociative responses across participants.</w:t>
       </w:r>
     </w:p>
     <w:p>
@@ -12440,10 +12237,10 @@
         </w:rPr>
         <w:lastRenderedPageBreak/>
         <w:drawing>
-          <wp:inline distT="0" distB="0" distL="0" distR="0" wp14:anchorId="65433406" wp14:editId="5F1F3DDE">
-            <wp:extent cx="4236558" cy="2965450"/>
-            <wp:effectExtent l="0" t="0" r="5715" b="0"/>
-            <wp:docPr id="1248831668" name="Picture 1"/>
+          <wp:inline distT="0" distB="0" distL="0" distR="0" wp14:anchorId="76AAA091" wp14:editId="14B4C7F5">
+            <wp:extent cx="5733415" cy="4013200"/>
+            <wp:effectExtent l="0" t="0" r="0" b="0"/>
+            <wp:docPr id="406078124" name="Picture 1"/>
             <wp:cNvGraphicFramePr>
               <a:graphicFrameLocks xmlns:a="http://schemas.openxmlformats.org/drawingml/2006/main" noChangeAspect="1"/>
             </wp:cNvGraphicFramePr>
@@ -12451,7 +12248,7 @@
               <a:graphicData uri="http://schemas.openxmlformats.org/drawingml/2006/picture">
                 <pic:pic xmlns:pic="http://schemas.openxmlformats.org/drawingml/2006/picture">
                   <pic:nvPicPr>
-                    <pic:cNvPr id="1248831668" name=""/>
+                    <pic:cNvPr id="406078124" name=""/>
                     <pic:cNvPicPr/>
                   </pic:nvPicPr>
                   <pic:blipFill>
@@ -12463,7 +12260,7 @@
                   <pic:spPr>
                     <a:xfrm>
                       <a:off x="0" y="0"/>
-                      <a:ext cx="4253065" cy="2977004"/>
+                      <a:ext cx="5733415" cy="4013200"/>
                     </a:xfrm>
                     <a:prstGeom prst="rect">
                       <a:avLst/>
@@ -12511,7 +12308,35 @@
         <w:rPr>
           <w:color w:val="000000" w:themeColor="text1"/>
         </w:rPr>
-        <w:t xml:space="preserve"> dissociative symptom severity (CADSS total score) during ketamine administration. Points represent individual participants; the solid line shows the linear fit with shaded 95% confidence interval. No significant association was observed (Pearson r = -0.056, p = 0.777).</w:t>
+        <w:t xml:space="preserve"> dissociative symptom severity (CADSS total score) during ketamine administration. Points represent individual participants; the solid line shows the linear fit with shaded 95% confidence interval. No significant association was observed (Pearson r = 0.0</w:t>
+      </w:r>
+      <w:r>
+        <w:rPr>
+          <w:rFonts w:hint="cs"/>
+          <w:color w:val="000000" w:themeColor="text1"/>
+          <w:rtl/>
+        </w:rPr>
+        <w:t>4</w:t>
+      </w:r>
+      <w:r>
+        <w:rPr>
+          <w:color w:val="000000" w:themeColor="text1"/>
+        </w:rPr>
+        <w:t>, p = 0.</w:t>
+      </w:r>
+      <w:r>
+        <w:rPr>
+          <w:rFonts w:hint="cs"/>
+          <w:color w:val="000000" w:themeColor="text1"/>
+          <w:rtl/>
+        </w:rPr>
+        <w:t>855</w:t>
+      </w:r>
+      <w:r>
+        <w:rPr>
+          <w:color w:val="000000" w:themeColor="text1"/>
+        </w:rPr>
+        <w:t>).</w:t>
       </w:r>
     </w:p>
     <w:p>
@@ -14699,27 +14524,14 @@
           <w:bCs/>
           <w:color w:val="000000" w:themeColor="text1"/>
         </w:rPr>
+        <w:lastRenderedPageBreak/>
         <w:t>Supplementary Table S5.</w:t>
       </w:r>
       <w:r>
         <w:rPr>
           <w:color w:val="000000" w:themeColor="text1"/>
         </w:rPr>
-        <w:t xml:space="preserve"> Pain-evoked brain activation during the ketamine session. Clusters reflect the painful &gt; non-painful contrast, except those marked ᵃ, which reflect non-painful &gt; painful stimulation. All clusters survived a </w:t>
-      </w:r>
-      <w:proofErr w:type="spellStart"/>
-      <w:r>
-        <w:rPr>
-          <w:color w:val="000000" w:themeColor="text1"/>
-        </w:rPr>
-        <w:t>voxelwise</w:t>
-      </w:r>
-      <w:proofErr w:type="spellEnd"/>
-      <w:r>
-        <w:rPr>
-          <w:color w:val="000000" w:themeColor="text1"/>
-        </w:rPr>
-        <w:t xml:space="preserve"> cluster-forming threshold of p &lt; .005 (uncorrected) and cluster-level FDR correction at p &lt; .05.</w:t>
+        <w:t xml:space="preserve"> Pain-evoked brain activation during the ketamine session. Clusters reflect the painful &gt; non-painful contrast, except those marked ᵃ, which reflect non-painful &gt; painful stimulation. All clusters survived a voxelwise cluster-forming threshold of p &lt; .005 (uncorrected) and cluster-level FDR correction at p &lt; .05.</w:t>
       </w:r>
     </w:p>
     <w:p>

</xml_diff>